<commit_message>
Complete Project 6 Phase 1 with Terraform ECR and image push.
Add ECR repository, scan-on-push, and lifecycle policy, and document the verified push of project6-api:latest.

Co-authored-by: Cursor <cursoragent@cursor.com>
</commit_message>
<xml_diff>
--- a/project-6-secure-containers/docs/Project 6 – Dockerfile Explained.docx
+++ b/project-6-secure-containers/docs/Project 6 – Dockerfile Explained.docx
@@ -98,18 +98,53 @@
     <w:p>
       <w:pPr>
         <w:rPr>
-          <w:sz w:val="22"/>
-          <w:szCs w:val="22"/>
-        </w:rPr>
-      </w:pPr>
-      <w:r>
-        <w:rPr>
-          <w:color w:val="E97132" w:themeColor="accent2"/>
-          <w:sz w:val="22"/>
-          <w:szCs w:val="22"/>
-        </w:rPr>
-        <w:t>ENV PYTHONDONTWRITEBYTECODE=1 \</w:t>
-      </w:r>
+          <w:color w:val="E97132" w:themeColor="accent2"/>
+          <w:sz w:val="22"/>
+          <w:szCs w:val="22"/>
+        </w:rPr>
+      </w:pPr>
+      <w:r>
+        <w:rPr>
+          <w:color w:val="E97132" w:themeColor="accent2"/>
+          <w:sz w:val="22"/>
+          <w:szCs w:val="22"/>
+        </w:rPr>
+        <w:t xml:space="preserve">ENV </w:t>
+      </w:r>
+    </w:p>
+    <w:p>
+      <w:pPr>
+        <w:rPr>
+          <w:sz w:val="22"/>
+          <w:szCs w:val="22"/>
+        </w:rPr>
+      </w:pPr>
+      <w:r>
+        <w:rPr>
+          <w:color w:val="E97132" w:themeColor="accent2"/>
+          <w:sz w:val="22"/>
+          <w:szCs w:val="22"/>
+        </w:rPr>
+        <w:t xml:space="preserve">    </w:t>
+      </w:r>
+      <w:r>
+        <w:rPr>
+          <w:color w:val="E97132" w:themeColor="accent2"/>
+          <w:sz w:val="22"/>
+          <w:szCs w:val="22"/>
+        </w:rPr>
+        <w:t>PYTHONDONTWRITEBYTECODE=</w:t>
+      </w:r>
+      <w:proofErr w:type="gramStart"/>
+      <w:r>
+        <w:rPr>
+          <w:color w:val="E97132" w:themeColor="accent2"/>
+          <w:sz w:val="22"/>
+          <w:szCs w:val="22"/>
+        </w:rPr>
+        <w:t>1 \</w:t>
+      </w:r>
+      <w:proofErr w:type="gramEnd"/>
       <w:r>
         <w:rPr>
           <w:sz w:val="22"/>
@@ -733,14 +768,7 @@
           <w:sz w:val="22"/>
           <w:szCs w:val="22"/>
         </w:rPr>
-        <w:t xml:space="preserve"> </w:t>
-      </w:r>
-      <w:r>
-        <w:rPr>
-          <w:sz w:val="22"/>
-          <w:szCs w:val="22"/>
-        </w:rPr>
-        <w:t xml:space="preserve">- </w:t>
+        <w:t xml:space="preserve"> - </w:t>
       </w:r>
       <w:r>
         <w:rPr>

</xml_diff>